<commit_message>
Correct Daraja callback docs: B2C/STK URLs are inline, not portal-registered
Verified live in production 2026-09-21:
- Only C2B Validation/Confirmation URLs are registered on the Daraja portal.
- B2C Result/QueueTimeout + STK CallBackURL are sent inline per-request.
- Documented B2C minimum amount (KES 10): sub-minimum payouts sync-ACK with
  ResponseCode 0 but async-decline with ResultCode 2 (limit rule).
</commit_message>
<xml_diff>
--- a/deploy/DARAJA_GO_LIVE.docx
+++ b/deploy/DARAJA_GO_LIVE.docx
@@ -2781,45 +2781,87 @@
         <w:t xml:space="preserve"> </w:t>
       </w:r>
       <w:r>
-        <w:t xml:space="preserve">- Register the</w:t>
-      </w:r>
-      <w:r>
-        <w:t xml:space="preserve"> </w:t>
-      </w:r>
-      <w:r>
-        <w:rPr>
-          <w:bCs/>
-          <w:b/>
-        </w:rPr>
-        <w:t xml:space="preserve">B2C Result URL and Queue Timeout URL</w:t>
-      </w:r>
-      <w:r>
-        <w:t xml:space="preserve"> </w:t>
-      </w:r>
-      <w:r>
-        <w:t xml:space="preserve">against the B2C</w:t>
-      </w:r>
-      <w:r>
-        <w:t xml:space="preserve"> </w:t>
-      </w:r>
-      <w:r>
-        <w:t xml:space="preserve">shortcode in the M-Pesa Org Portal / your app config.</w:t>
-      </w:r>
-      <w:r>
-        <w:t xml:space="preserve"> </w:t>
-      </w:r>
-      <w:r>
-        <w:t xml:space="preserve">- Register the</w:t>
-      </w:r>
-      <w:r>
-        <w:t xml:space="preserve"> </w:t>
-      </w:r>
-      <w:r>
-        <w:rPr>
-          <w:bCs/>
-          <w:b/>
-        </w:rPr>
-        <w:t xml:space="preserve">C2B Validation &amp; Confirmation URLs</w:t>
+        <w:t xml:space="preserve">-</w:t>
+      </w:r>
+      <w:r>
+        <w:t xml:space="preserve"> </w:t>
+      </w:r>
+      <w:r>
+        <w:rPr>
+          <w:bCs/>
+          <w:b/>
+        </w:rPr>
+        <w:t xml:space="preserve">Only C2B is registered on the portal.</w:t>
+      </w:r>
+      <w:r>
+        <w:t xml:space="preserve"> </w:t>
+      </w:r>
+      <w:r>
+        <w:t xml:space="preserve">The Daraja portal</w:t>
+      </w:r>
+      <w:r>
+        <w:t xml:space="preserve"> </w:t>
+      </w:r>
+      <w:r>
+        <w:t xml:space="preserve">“</w:t>
+      </w:r>
+      <w:r>
+        <w:t xml:space="preserve">URL Management</w:t>
+      </w:r>
+      <w:r>
+        <w:t xml:space="preserve">”</w:t>
+      </w:r>
+      <w:r>
+        <w:t xml:space="preserve"> </w:t>
+      </w:r>
+      <w:r>
+        <w:t xml:space="preserve">screen provisions exactly two URLs — the</w:t>
+      </w:r>
+      <w:r>
+        <w:t xml:space="preserve"> </w:t>
+      </w:r>
+      <w:r>
+        <w:rPr>
+          <w:bCs/>
+          <w:b/>
+        </w:rPr>
+        <w:t xml:space="preserve">C2B Validation URL</w:t>
+      </w:r>
+      <w:r>
+        <w:t xml:space="preserve"> </w:t>
+      </w:r>
+      <w:r>
+        <w:t xml:space="preserve">and</w:t>
+      </w:r>
+      <w:r>
+        <w:t xml:space="preserve"> </w:t>
+      </w:r>
+      <w:r>
+        <w:rPr>
+          <w:bCs/>
+          <w:b/>
+        </w:rPr>
+        <w:t xml:space="preserve">C2B</w:t>
+      </w:r>
+      <w:r>
+        <w:rPr>
+          <w:bCs/>
+          <w:b/>
+        </w:rPr>
+        <w:t xml:space="preserve"> </w:t>
+      </w:r>
+      <w:r>
+        <w:rPr>
+          <w:bCs/>
+          <w:b/>
+        </w:rPr>
+        <w:t xml:space="preserve">Confirmation URL</w:t>
+      </w:r>
+      <w:r>
+        <w:t xml:space="preserve"> </w:t>
+      </w:r>
+      <w:r>
+        <w:t xml:space="preserve">— and that is all it should show. Register them there, or</w:t>
       </w:r>
       <w:r>
         <w:t xml:space="preserve"> </w:t>
@@ -2855,7 +2897,81 @@
         <w:t xml:space="preserve"> </w:t>
       </w:r>
       <w:r>
-        <w:t xml:space="preserve">does this) or the portal.</w:t>
+        <w:t xml:space="preserve">does this).</w:t>
+      </w:r>
+      <w:r>
+        <w:t xml:space="preserve"> </w:t>
+      </w:r>
+      <w:r>
+        <w:t xml:space="preserve">-</w:t>
+      </w:r>
+      <w:r>
+        <w:t xml:space="preserve"> </w:t>
+      </w:r>
+      <w:r>
+        <w:rPr>
+          <w:bCs/>
+          <w:b/>
+        </w:rPr>
+        <w:t xml:space="preserve">B2C Result/Queue-Timeout URLs are NOT registered anywhere</w:t>
+      </w:r>
+      <w:r>
+        <w:t xml:space="preserve"> </w:t>
+      </w:r>
+      <w:r>
+        <w:t xml:space="preserve">— they are sent</w:t>
+      </w:r>
+      <w:r>
+        <w:t xml:space="preserve"> </w:t>
+      </w:r>
+      <w:r>
+        <w:rPr>
+          <w:bCs/>
+          <w:b/>
+        </w:rPr>
+        <w:t xml:space="preserve">inline in every B2C request payload</w:t>
+      </w:r>
+      <w:r>
+        <w:t xml:space="preserve"> </w:t>
+      </w:r>
+      <w:r>
+        <w:t xml:space="preserve">(</w:t>
+      </w:r>
+      <w:r>
+        <w:rPr>
+          <w:rStyle w:val="VerbatimChar"/>
+        </w:rPr>
+        <w:t xml:space="preserve">ResultURL</w:t>
+      </w:r>
+      <w:r>
+        <w:t xml:space="preserve"> </w:t>
+      </w:r>
+      <w:r>
+        <w:t xml:space="preserve">/</w:t>
+      </w:r>
+      <w:r>
+        <w:t xml:space="preserve"> </w:t>
+      </w:r>
+      <w:r>
+        <w:rPr>
+          <w:rStyle w:val="VerbatimChar"/>
+        </w:rPr>
+        <w:t xml:space="preserve">QueueTimeOutURL</w:t>
+      </w:r>
+      <w:r>
+        <w:t xml:space="preserve">).</w:t>
+      </w:r>
+      <w:r>
+        <w:t xml:space="preserve"> </w:t>
+      </w:r>
+      <w:r>
+        <w:t xml:space="preserve">VERIFIED LIVE 2026-09-21: a production B2C payout delivered its result to an</w:t>
+      </w:r>
+      <w:r>
+        <w:t xml:space="preserve"> </w:t>
+      </w:r>
+      <w:r>
+        <w:t xml:space="preserve">inline URL with no portal registration whatsoever.</w:t>
       </w:r>
       <w:r>
         <w:t xml:space="preserve"> </w:t>
@@ -2877,13 +2993,134 @@
         <w:t xml:space="preserve"> </w:t>
       </w:r>
       <w:r>
-        <w:t xml:space="preserve">is sent inline on each STK push — no pre-registration,</w:t>
-      </w:r>
-      <w:r>
-        <w:t xml:space="preserve"> </w:t>
-      </w:r>
-      <w:r>
-        <w:t xml:space="preserve">but Safaricom must be able to reach it (public HTTPS).</w:t>
+        <w:t xml:space="preserve">is likewise sent</w:t>
+      </w:r>
+      <w:r>
+        <w:t xml:space="preserve"> </w:t>
+      </w:r>
+      <w:r>
+        <w:rPr>
+          <w:bCs/>
+          <w:b/>
+        </w:rPr>
+        <w:t xml:space="preserve">inline on each STK push</w:t>
+      </w:r>
+      <w:r>
+        <w:t xml:space="preserve"> </w:t>
+      </w:r>
+      <w:r>
+        <w:t xml:space="preserve">— no</w:t>
+      </w:r>
+      <w:r>
+        <w:t xml:space="preserve"> </w:t>
+      </w:r>
+      <w:r>
+        <w:t xml:space="preserve">pre-registration. Both STK and B2C inline URLs must simply be public HTTPS and</w:t>
+      </w:r>
+      <w:r>
+        <w:t xml:space="preserve"> </w:t>
+      </w:r>
+      <w:r>
+        <w:t xml:space="preserve">reachable by Safaricom.</w:t>
+      </w:r>
+      <w:r>
+        <w:t xml:space="preserve"> </w:t>
+      </w:r>
+      <w:r>
+        <w:t xml:space="preserve">-</w:t>
+      </w:r>
+      <w:r>
+        <w:t xml:space="preserve"> </w:t>
+      </w:r>
+      <w:r>
+        <w:rPr>
+          <w:bCs/>
+          <w:b/>
+        </w:rPr>
+        <w:t xml:space="preserve">B2C minimum amount is KES 10.</w:t>
+      </w:r>
+      <w:r>
+        <w:t xml:space="preserve"> </w:t>
+      </w:r>
+      <w:r>
+        <w:t xml:space="preserve">A payout below the minimum is accepted at the</w:t>
+      </w:r>
+      <w:r>
+        <w:t xml:space="preserve"> </w:t>
+      </w:r>
+      <w:r>
+        <w:t xml:space="preserve">sync step (</w:t>
+      </w:r>
+      <w:r>
+        <w:rPr>
+          <w:rStyle w:val="VerbatimChar"/>
+        </w:rPr>
+        <w:t xml:space="preserve">ResponseCode 0</w:t>
+      </w:r>
+      <w:r>
+        <w:t xml:space="preserve">) but then</w:t>
+      </w:r>
+      <w:r>
+        <w:t xml:space="preserve"> </w:t>
+      </w:r>
+      <w:r>
+        <w:rPr>
+          <w:bCs/>
+          <w:b/>
+        </w:rPr>
+        <w:t xml:space="preserve">declined asynchronously</w:t>
+      </w:r>
+      <w:r>
+        <w:t xml:space="preserve"> </w:t>
+      </w:r>
+      <w:r>
+        <w:t xml:space="preserve">on the</w:t>
+      </w:r>
+      <w:r>
+        <w:t xml:space="preserve"> </w:t>
+      </w:r>
+      <w:r>
+        <w:t xml:space="preserve">ResultURL with</w:t>
+      </w:r>
+      <w:r>
+        <w:t xml:space="preserve"> </w:t>
+      </w:r>
+      <w:r>
+        <w:rPr>
+          <w:rStyle w:val="VerbatimChar"/>
+        </w:rPr>
+        <w:t xml:space="preserve">ResultCode 2 — "Declined due to limit rule: less than the   minimum transaction amount."</w:t>
+      </w:r>
+      <w:r>
+        <w:t xml:space="preserve"> </w:t>
+      </w:r>
+      <w:r>
+        <w:t xml:space="preserve">STK push has no such floor (KES 1 works). Always</w:t>
+      </w:r>
+      <w:r>
+        <w:t xml:space="preserve"> </w:t>
+      </w:r>
+      <w:r>
+        <w:t xml:space="preserve">confirm settlement from the</w:t>
+      </w:r>
+      <w:r>
+        <w:t xml:space="preserve"> </w:t>
+      </w:r>
+      <w:r>
+        <w:rPr>
+          <w:bCs/>
+          <w:b/>
+        </w:rPr>
+        <w:t xml:space="preserve">async ResultURL callback</w:t>
+      </w:r>
+      <w:r>
+        <w:t xml:space="preserve">, never from the sync</w:t>
+      </w:r>
+      <w:r>
+        <w:t xml:space="preserve"> </w:t>
+      </w:r>
+      <w:r>
+        <w:t xml:space="preserve">acknowledgement alone.</w:t>
       </w:r>
       <w:r>
         <w:t xml:space="preserve"> </w:t>

</xml_diff>